<commit_message>
Update retail campaign project and deployment files
</commit_message>
<xml_diff>
--- a/PROJECT RETAIL ANALYTICS-PHASES 3&4.docx
+++ b/PROJECT RETAIL ANALYTICS-PHASES 3&4.docx
@@ -257,12 +257,6 @@
     </w:p>
     <w:sdt>
       <w:sdtPr>
-        <w:rPr>
-          <w:rFonts w:asciiTheme="minorHAnsi" w:eastAsiaTheme="minorHAnsi" w:hAnsiTheme="minorHAnsi" w:cstheme="minorBidi"/>
-          <w:color w:val="auto"/>
-          <w:sz w:val="24"/>
-          <w:szCs w:val="24"/>
-        </w:rPr>
         <w:id w:val="-1905525056"/>
         <w:docPartObj>
           <w:docPartGallery w:val="Table of Contents"/>
@@ -271,9 +265,13 @@
       </w:sdtPr>
       <w:sdtEndPr>
         <w:rPr>
+          <w:rFonts w:asciiTheme="minorHAnsi" w:eastAsiaTheme="minorHAnsi" w:hAnsiTheme="minorHAnsi" w:cstheme="minorBidi"/>
           <w:b/>
           <w:bCs/>
           <w:noProof/>
+          <w:color w:val="auto"/>
+          <w:sz w:val="24"/>
+          <w:szCs w:val="24"/>
         </w:rPr>
       </w:sdtEndPr>
       <w:sdtContent>
@@ -6491,7 +6489,6 @@
       <w:r>
         <w:rPr>
           <w:rFonts w:eastAsia="Times New Roman" w:cstheme="minorHAnsi"/>
-          <w:noProof/>
           <w:color w:val="222222"/>
           <w:lang w:val="en-IN"/>
         </w:rPr>
@@ -6575,7 +6572,6 @@
       <w:r>
         <w:rPr>
           <w:rFonts w:eastAsia="Times New Roman" w:cstheme="minorHAnsi"/>
-          <w:noProof/>
           <w:color w:val="222222"/>
           <w:lang w:val="en-IN"/>
         </w:rPr>
@@ -6677,7 +6673,6 @@
       <w:r>
         <w:rPr>
           <w:rFonts w:eastAsia="Times New Roman" w:cstheme="minorHAnsi"/>
-          <w:noProof/>
           <w:color w:val="222222"/>
           <w:lang w:val="en-IN"/>
         </w:rPr>
@@ -6765,7 +6760,6 @@
       <w:r>
         <w:rPr>
           <w:rFonts w:eastAsia="Times New Roman" w:cstheme="minorHAnsi"/>
-          <w:noProof/>
           <w:color w:val="222222"/>
           <w:lang w:val="en-IN"/>
         </w:rPr>
@@ -6872,7 +6866,6 @@
       <w:r>
         <w:rPr>
           <w:rFonts w:eastAsia="Times New Roman" w:cstheme="minorHAnsi"/>
-          <w:noProof/>
           <w:color w:val="222222"/>
           <w:lang w:val="en-IN"/>
         </w:rPr>
@@ -7153,7 +7146,6 @@
       <w:r>
         <w:rPr>
           <w:rFonts w:eastAsia="Times New Roman" w:cstheme="minorHAnsi"/>
-          <w:noProof/>
           <w:color w:val="222222"/>
           <w:lang w:val="en-IN"/>
         </w:rPr>
@@ -7293,7 +7285,6 @@
       <w:r>
         <w:rPr>
           <w:rFonts w:ascii="Consolas" w:eastAsia="Times New Roman" w:hAnsi="Consolas" w:cs="Courier New"/>
-          <w:noProof/>
           <w:sz w:val="20"/>
           <w:szCs w:val="20"/>
           <w:lang w:eastAsia="en-GB"/>
@@ -8149,7 +8140,6 @@
       <w:r>
         <w:rPr>
           <w:rFonts w:eastAsia="Times New Roman" w:cstheme="minorHAnsi"/>
-          <w:noProof/>
           <w:color w:val="222222"/>
           <w:lang w:val="en-IN"/>
         </w:rPr>
@@ -8337,7 +8327,6 @@
       <w:r>
         <w:rPr>
           <w:rFonts w:eastAsia="Times New Roman" w:cstheme="minorHAnsi"/>
-          <w:noProof/>
           <w:color w:val="333333"/>
           <w:lang w:val="en-IN"/>
         </w:rPr>
@@ -8595,7 +8584,6 @@
       <w:r>
         <w:rPr>
           <w:rFonts w:eastAsia="Times New Roman" w:cstheme="minorHAnsi"/>
-          <w:noProof/>
           <w:color w:val="222222"/>
           <w:lang w:val="en-IN"/>
         </w:rPr>
@@ -8956,7 +8944,6 @@
       </w:pPr>
       <w:r>
         <w:rPr>
-          <w:noProof/>
           <w:lang w:val="en-IN"/>
         </w:rPr>
         <w:drawing>
@@ -9008,7 +8995,6 @@
       <w:r>
         <w:rPr>
           <w:rFonts w:eastAsia="Times New Roman" w:cstheme="minorHAnsi"/>
-          <w:noProof/>
           <w:color w:val="222222"/>
           <w:lang w:val="en-IN"/>
         </w:rPr>
@@ -9204,7 +9190,6 @@
       <w:r>
         <w:rPr>
           <w:rFonts w:eastAsia="Times New Roman" w:cstheme="minorHAnsi"/>
-          <w:noProof/>
           <w:color w:val="222222"/>
           <w:lang w:val="en-IN"/>
         </w:rPr>
@@ -9292,7 +9277,6 @@
       <w:r>
         <w:rPr>
           <w:rFonts w:eastAsia="Times New Roman" w:cstheme="minorHAnsi"/>
-          <w:noProof/>
           <w:color w:val="222222"/>
           <w:lang w:val="en-IN"/>
         </w:rPr>
@@ -9549,7 +9533,6 @@
       <w:r>
         <w:rPr>
           <w:rFonts w:eastAsia="Times New Roman" w:cstheme="minorHAnsi"/>
-          <w:noProof/>
           <w:color w:val="222222"/>
           <w:lang w:val="en-IN"/>
         </w:rPr>
@@ -9891,7 +9874,6 @@
       <w:r>
         <w:rPr>
           <w:rFonts w:eastAsia="Times New Roman" w:cstheme="minorHAnsi"/>
-          <w:noProof/>
           <w:color w:val="222222"/>
           <w:lang w:val="en-IN"/>
         </w:rPr>
@@ -10196,7 +10178,6 @@
       <w:r>
         <w:rPr>
           <w:rFonts w:eastAsia="Times New Roman" w:cstheme="minorHAnsi"/>
-          <w:noProof/>
           <w:color w:val="222222"/>
           <w:lang w:val="en-IN"/>
         </w:rPr>
@@ -10305,7 +10286,6 @@
       <w:r>
         <w:rPr>
           <w:rFonts w:eastAsia="Times New Roman" w:cstheme="minorHAnsi"/>
-          <w:noProof/>
           <w:color w:val="222222"/>
           <w:lang w:val="en-IN"/>
         </w:rPr>
@@ -10667,7 +10647,6 @@
       <w:r>
         <w:rPr>
           <w:rFonts w:eastAsia="Times New Roman" w:cstheme="minorHAnsi"/>
-          <w:noProof/>
           <w:color w:val="222222"/>
           <w:lang w:val="en-IN"/>
         </w:rPr>
@@ -10720,7 +10699,6 @@
       <w:r>
         <w:rPr>
           <w:rFonts w:eastAsia="Times New Roman" w:cstheme="minorHAnsi"/>
-          <w:noProof/>
           <w:color w:val="222222"/>
           <w:lang w:val="en-IN"/>
         </w:rPr>
@@ -11855,7 +11833,6 @@
       <w:r>
         <w:rPr>
           <w:rFonts w:eastAsia="Times New Roman" w:cstheme="minorHAnsi"/>
-          <w:noProof/>
           <w:color w:val="222222"/>
           <w:lang w:val="en-IN"/>
         </w:rPr>
@@ -13701,7 +13678,6 @@
       <w:r>
         <w:rPr>
           <w:rFonts w:cstheme="minorHAnsi"/>
-          <w:noProof/>
         </w:rPr>
         <w:drawing>
           <wp:inline distT="0" distB="0" distL="0" distR="0" wp14:anchorId="7EE175B1" wp14:editId="55E662FB">
@@ -13756,7 +13732,6 @@
       <w:r>
         <w:rPr>
           <w:rFonts w:cstheme="minorHAnsi"/>
-          <w:noProof/>
         </w:rPr>
         <w:lastRenderedPageBreak/>
         <w:drawing>
@@ -17115,7 +17090,6 @@
   <w:style w:type="character" w:default="1" w:styleId="DefaultParagraphFont">
     <w:name w:val="Default Paragraph Font"/>
     <w:uiPriority w:val="1"/>
-    <w:semiHidden/>
     <w:unhideWhenUsed/>
   </w:style>
   <w:style w:type="table" w:default="1" w:styleId="TableNormal">
@@ -17904,10 +17878,4 @@
     <ds:schemaRef ds:uri="http://schemas.openxmlformats.org/officeDocument/2006/bibliography"/>
   </ds:schemaRefs>
 </ds:datastoreItem>
-</file>
-
-<file path=docMetadata/LabelInfo.xml><?xml version="1.0" encoding="utf-8"?>
-<clbl:labelList xmlns:clbl="http://schemas.microsoft.com/office/2020/mipLabelMetadata">
-  <clbl:label id="{b92827a0-8eb1-44cd-84ff-67967e8fbfda}" enabled="0" method="" siteId="{b92827a0-8eb1-44cd-84ff-67967e8fbfda}" removed="1"/>
-</clbl:labelList>
 </file>
</xml_diff>